<commit_message>
Drop SVG/PDF figures, remove S5.1/S5.2 from supplement, add R cosinor scripts
- Delete all .svg and .pdf figure copies (keep PNG only).
- Remove supplement figures S5.1 (HR rhythm across nested behavioral
  adjustments) and S5.2 (within-person SDs unadjusted vs adjusted); the
  nested-model tables (S5.1-S5.7) remain.
- Add code/cosinor_R/ with the R scripts used for cosinor mixed-effects
  fitting upstream (cosinor_fit.R single-component; cosinor_fit_h12.R
  multicomponent 24+12-hour).

Co-Authored-By: Claude Opus 4.7 (1M context) <noreply@anthropic.com>
</commit_message>
<xml_diff>
--- a/supplement/supplement.docx
+++ b/supplement/supplement.docx
@@ -24382,168 +24382,6 @@
           <w:sz w:val="24"/>
         </w:rPr>
         <w:t>ΔAUC = change in area under the ROC curve relative to M1. LRT = likelihood ratio test against M1. Bold p-values indicate p &lt; .05. * p &lt; .05, ** p &lt; .01, *** p &lt; .001.</w:t>
-      </w:r>
-    </w:p>
-    <w:p>
-      <w:r>
-        <w:rPr>
-          <w:rFonts w:ascii="Arial" w:hAnsi="Arial" w:eastAsia="Arial" w:cs="Arial"/>
-          <w:b/>
-          <w:i w:val="0"/>
-          <w:sz w:val="24"/>
-        </w:rPr>
-        <w:t>Figure S5.1</w:t>
-      </w:r>
-    </w:p>
-    <w:p>
-      <w:r>
-        <w:rPr>
-          <w:rFonts w:ascii="Arial" w:hAnsi="Arial" w:eastAsia="Arial" w:cs="Arial"/>
-          <w:b w:val="0"/>
-          <w:i/>
-          <w:sz w:val="24"/>
-        </w:rPr>
-        <w:t>HR Rhythm Parameters Across Nested Behavioral Adjustments.</w:t>
-      </w:r>
-    </w:p>
-    <w:p>
-      <w:pPr>
-        <w:jc w:val="center"/>
-      </w:pPr>
-      <w:r>
-        <w:drawing>
-          <wp:inline xmlns:a="http://schemas.openxmlformats.org/drawingml/2006/main" xmlns:pic="http://schemas.openxmlformats.org/drawingml/2006/picture">
-            <wp:extent cx="5486400" cy="1861032"/>
-            <wp:docPr id="9" name="Picture 9"/>
-            <wp:cNvGraphicFramePr>
-              <a:graphicFrameLocks noChangeAspect="1"/>
-            </wp:cNvGraphicFramePr>
-            <a:graphic>
-              <a:graphicData uri="http://schemas.openxmlformats.org/drawingml/2006/picture">
-                <pic:pic>
-                  <pic:nvPicPr>
-                    <pic:cNvPr id="0" name="FigS5_1_hr_across_nested.png"/>
-                    <pic:cNvPicPr/>
-                  </pic:nvPicPr>
-                  <pic:blipFill>
-                    <a:blip r:embed="rId17"/>
-                    <a:stretch>
-                      <a:fillRect/>
-                    </a:stretch>
-                  </pic:blipFill>
-                  <pic:spPr>
-                    <a:xfrm>
-                      <a:off x="0" y="0"/>
-                      <a:ext cx="5486400" cy="1861032"/>
-                    </a:xfrm>
-                    <a:prstGeom prst="rect"/>
-                  </pic:spPr>
-                </pic:pic>
-              </a:graphicData>
-            </a:graphic>
-          </wp:inline>
-        </w:drawing>
-      </w:r>
-    </w:p>
-    <w:p>
-      <w:r>
-        <w:rPr>
-          <w:rFonts w:ascii="Arial" w:hAnsi="Arial" w:eastAsia="Arial" w:cs="Arial"/>
-          <w:b w:val="0"/>
-          <w:i/>
-          <w:sz w:val="24"/>
-        </w:rPr>
-        <w:t xml:space="preserve">Note. </w:t>
-      </w:r>
-      <w:r>
-        <w:rPr>
-          <w:rFonts w:ascii="Arial" w:hAnsi="Arial" w:eastAsia="Arial" w:cs="Arial"/>
-          <w:b w:val="0"/>
-          <w:i w:val="0"/>
-          <w:sz w:val="24"/>
-        </w:rPr>
-        <w:t>Each panel shows one outcome (depression, obesity, hypertension). Markers and connecting lines show how the OR for each HR parameter (mesor, amplitude, acrophase) shifts across the four nested model specifications. Vertical dashed line at OR = 1. x-axis on log scale.</w:t>
-      </w:r>
-    </w:p>
-    <w:p>
-      <w:r>
-        <w:rPr>
-          <w:rFonts w:ascii="Arial" w:hAnsi="Arial" w:eastAsia="Arial" w:cs="Arial"/>
-          <w:b/>
-          <w:i w:val="0"/>
-          <w:sz w:val="24"/>
-        </w:rPr>
-        <w:t>Figure S5.2</w:t>
-      </w:r>
-    </w:p>
-    <w:p>
-      <w:r>
-        <w:rPr>
-          <w:rFonts w:ascii="Arial" w:hAnsi="Arial" w:eastAsia="Arial" w:cs="Arial"/>
-          <w:b w:val="0"/>
-          <w:i/>
-          <w:sz w:val="24"/>
-        </w:rPr>
-        <w:t>Within-Person Rhythm SDs: Unadjusted Versus Behavior-Adjusted Odds Ratios.</w:t>
-      </w:r>
-    </w:p>
-    <w:p>
-      <w:pPr>
-        <w:jc w:val="center"/>
-      </w:pPr>
-      <w:r>
-        <w:drawing>
-          <wp:inline xmlns:a="http://schemas.openxmlformats.org/drawingml/2006/main" xmlns:pic="http://schemas.openxmlformats.org/drawingml/2006/picture">
-            <wp:extent cx="5486400" cy="1663506"/>
-            <wp:docPr id="10" name="Picture 10"/>
-            <wp:cNvGraphicFramePr>
-              <a:graphicFrameLocks noChangeAspect="1"/>
-            </wp:cNvGraphicFramePr>
-            <a:graphic>
-              <a:graphicData uri="http://schemas.openxmlformats.org/drawingml/2006/picture">
-                <pic:pic>
-                  <pic:nvPicPr>
-                    <pic:cNvPr id="0" name="FigS5_2_wp_adjusted.png"/>
-                    <pic:cNvPicPr/>
-                  </pic:nvPicPr>
-                  <pic:blipFill>
-                    <a:blip r:embed="rId18"/>
-                    <a:stretch>
-                      <a:fillRect/>
-                    </a:stretch>
-                  </pic:blipFill>
-                  <pic:spPr>
-                    <a:xfrm>
-                      <a:off x="0" y="0"/>
-                      <a:ext cx="5486400" cy="1663506"/>
-                    </a:xfrm>
-                    <a:prstGeom prst="rect"/>
-                  </pic:spPr>
-                </pic:pic>
-              </a:graphicData>
-            </a:graphic>
-          </wp:inline>
-        </w:drawing>
-      </w:r>
-    </w:p>
-    <w:p>
-      <w:r>
-        <w:rPr>
-          <w:rFonts w:ascii="Arial" w:hAnsi="Arial" w:eastAsia="Arial" w:cs="Arial"/>
-          <w:b w:val="0"/>
-          <w:i/>
-          <w:sz w:val="24"/>
-        </w:rPr>
-        <w:t xml:space="preserve">Note. </w:t>
-      </w:r>
-      <w:r>
-        <w:rPr>
-          <w:rFonts w:ascii="Arial" w:hAnsi="Arial" w:eastAsia="Arial" w:cs="Arial"/>
-          <w:b w:val="0"/>
-          <w:i w:val="0"/>
-          <w:sz w:val="24"/>
-        </w:rPr>
-        <w:t>Black markers: unadjusted models. Red markers: models adjusted for scale-matched within-person behavioral SDs. Vertical dashed line at OR = 1. x-axis on log scale.</w:t>
       </w:r>
     </w:p>
     <w:sectPr>

</xml_diff>